<commit_message>
feat: adiciona documentação técnica
</commit_message>
<xml_diff>
--- a/documentacao_processador_mips.docx
+++ b/documentacao_processador_mips.docx
@@ -478,12 +478,6 @@
         <w:gridCol w:w="9000"/>
       </w:tblGrid>
       <w:tr>
-        <w:tblPrEx>
-          <w:tblCellMar>
-            <w:top w:w="0" w:type="dxa"/>
-            <w:bottom w:w="0" w:type="dxa"/>
-          </w:tblCellMar>
-        </w:tblPrEx>
         <w:tc>
           <w:tcPr>
             <w:tcW w:w="9000" w:type="dxa"/>
@@ -831,218 +825,66 @@
     <w:p>
       <w:pPr>
         <w:spacing w:after="60"/>
-      </w:pPr>
-    </w:p>
-    <w:p>
-      <w:pPr>
-        <w:spacing w:before="60" w:after="120"/>
-      </w:pPr>
-      <w:r>
-        <w:rPr>
-          <w:rFonts w:ascii="Courier New" w:eastAsia="Courier New" w:hAnsi="Courier New" w:cs="Courier New"/>
-          <w:sz w:val="18"/>
-          <w:szCs w:val="18"/>
-        </w:rPr>
-        <w:t xml:space="preserve">   ┌──────────────────────────────────────────────────────────────────────────┐   │                        PROCESSADOR MIPS 8-bit                           │   │                       Arquitetura Monociclo                             │   └──────────────────────────────────────────────────────────────────────────┘       </w:t>
-      </w:r>
-      <w:proofErr w:type="spellStart"/>
-      <w:r>
-        <w:rPr>
-          <w:rFonts w:ascii="Courier New" w:eastAsia="Courier New" w:hAnsi="Courier New" w:cs="Courier New"/>
-          <w:sz w:val="18"/>
-          <w:szCs w:val="18"/>
-        </w:rPr>
-        <w:t>Clock</w:t>
-      </w:r>
-      <w:proofErr w:type="spellEnd"/>
-      <w:r>
-        <w:rPr>
-          <w:rFonts w:ascii="Courier New" w:eastAsia="Courier New" w:hAnsi="Courier New" w:cs="Courier New"/>
-          <w:sz w:val="18"/>
-          <w:szCs w:val="18"/>
-        </w:rPr>
-        <w:t xml:space="preserve"> ──► PC Register ──► ROM (Memória de Instrução)                     │                      │                     ▼                      ▼               </w:t>
-      </w:r>
-      <w:proofErr w:type="spellStart"/>
-      <w:r>
-        <w:rPr>
-          <w:rFonts w:ascii="Courier New" w:eastAsia="Courier New" w:hAnsi="Courier New" w:cs="Courier New"/>
-          <w:sz w:val="18"/>
-          <w:szCs w:val="18"/>
-        </w:rPr>
-        <w:t>Adder</w:t>
-      </w:r>
-      <w:proofErr w:type="spellEnd"/>
-      <w:r>
-        <w:rPr>
-          <w:rFonts w:ascii="Courier New" w:eastAsia="Courier New" w:hAnsi="Courier New" w:cs="Courier New"/>
-          <w:sz w:val="18"/>
-          <w:szCs w:val="18"/>
-        </w:rPr>
-        <w:t xml:space="preserve"> (+1)            Splitter (18 bits)                     │           ┌──────────┬────────┬────────┬────────┐                     │        </w:t>
-      </w:r>
-      <w:proofErr w:type="spellStart"/>
-      <w:r>
-        <w:rPr>
-          <w:rFonts w:ascii="Courier New" w:eastAsia="Courier New" w:hAnsi="Courier New" w:cs="Courier New"/>
-          <w:sz w:val="18"/>
-          <w:szCs w:val="18"/>
-        </w:rPr>
-        <w:t>opcode</w:t>
-      </w:r>
-      <w:proofErr w:type="spellEnd"/>
-      <w:r>
-        <w:rPr>
-          <w:rFonts w:ascii="Courier New" w:eastAsia="Courier New" w:hAnsi="Courier New" w:cs="Courier New"/>
-          <w:sz w:val="18"/>
-          <w:szCs w:val="18"/>
-        </w:rPr>
-        <w:t xml:space="preserve">(3) </w:t>
-      </w:r>
-      <w:proofErr w:type="spellStart"/>
-      <w:r>
-        <w:rPr>
-          <w:rFonts w:ascii="Courier New" w:eastAsia="Courier New" w:hAnsi="Courier New" w:cs="Courier New"/>
-          <w:sz w:val="18"/>
-          <w:szCs w:val="18"/>
-        </w:rPr>
-        <w:t>rs</w:t>
-      </w:r>
-      <w:proofErr w:type="spellEnd"/>
-      <w:r>
-        <w:rPr>
-          <w:rFonts w:ascii="Courier New" w:eastAsia="Courier New" w:hAnsi="Courier New" w:cs="Courier New"/>
-          <w:sz w:val="18"/>
-          <w:szCs w:val="18"/>
-        </w:rPr>
-        <w:t xml:space="preserve">(3) </w:t>
-      </w:r>
-      <w:proofErr w:type="spellStart"/>
-      <w:r>
-        <w:rPr>
-          <w:rFonts w:ascii="Courier New" w:eastAsia="Courier New" w:hAnsi="Courier New" w:cs="Courier New"/>
-          <w:sz w:val="18"/>
-          <w:szCs w:val="18"/>
-        </w:rPr>
-        <w:t>rt</w:t>
-      </w:r>
-      <w:proofErr w:type="spellEnd"/>
-      <w:r>
-        <w:rPr>
-          <w:rFonts w:ascii="Courier New" w:eastAsia="Courier New" w:hAnsi="Courier New" w:cs="Courier New"/>
-          <w:sz w:val="18"/>
-          <w:szCs w:val="18"/>
-        </w:rPr>
-        <w:t xml:space="preserve">(3) rd(3) </w:t>
-      </w:r>
-      <w:proofErr w:type="spellStart"/>
-      <w:r>
-        <w:rPr>
-          <w:rFonts w:ascii="Courier New" w:eastAsia="Courier New" w:hAnsi="Courier New" w:cs="Courier New"/>
-          <w:sz w:val="18"/>
-          <w:szCs w:val="18"/>
-        </w:rPr>
-        <w:t>shamt</w:t>
-      </w:r>
-      <w:proofErr w:type="spellEnd"/>
-      <w:r>
-        <w:rPr>
-          <w:rFonts w:ascii="Courier New" w:eastAsia="Courier New" w:hAnsi="Courier New" w:cs="Courier New"/>
-          <w:sz w:val="18"/>
-          <w:szCs w:val="18"/>
-        </w:rPr>
-        <w:t xml:space="preserve">(3) </w:t>
-      </w:r>
-      <w:proofErr w:type="spellStart"/>
-      <w:r>
-        <w:rPr>
-          <w:rFonts w:ascii="Courier New" w:eastAsia="Courier New" w:hAnsi="Courier New" w:cs="Courier New"/>
-          <w:sz w:val="18"/>
-          <w:szCs w:val="18"/>
-        </w:rPr>
-        <w:t>imm</w:t>
-      </w:r>
-      <w:proofErr w:type="spellEnd"/>
-      <w:r>
-        <w:rPr>
-          <w:rFonts w:ascii="Courier New" w:eastAsia="Courier New" w:hAnsi="Courier New" w:cs="Courier New"/>
-          <w:sz w:val="18"/>
-          <w:szCs w:val="18"/>
-        </w:rPr>
-        <w:t>(8)                     │           │          │        │                     │           ▼          │        │                     │    Unidade de        │        │                     │    Controle ─────────┼────────┼────── Sinais de Controle                     │           │          ▼        ▼                     │           │     Banco de Registradores                     │           │       (8 registradores × 8 bits)                     │           │          │ Data1   │ Data2                     │           │          ▼         ▼                     │           │          ULA (ALU)                     │           │    (ADD/SUB/MUL/DIV/SHL/SHR/CMP)                     │           │          │ Resultado                     │           │          ├──► RAM (Memória de Dados)                     │           │          │       │</w:t>
-      </w:r>
-      <w:proofErr w:type="spellStart"/>
-      <w:r>
-        <w:rPr>
-          <w:rFonts w:ascii="Courier New" w:eastAsia="Courier New" w:hAnsi="Courier New" w:cs="Courier New"/>
-          <w:sz w:val="18"/>
-          <w:szCs w:val="18"/>
-        </w:rPr>
-        <w:t>MemRead</w:t>
-      </w:r>
-      <w:proofErr w:type="spellEnd"/>
-      <w:r>
-        <w:rPr>
-          <w:rFonts w:ascii="Courier New" w:eastAsia="Courier New" w:hAnsi="Courier New" w:cs="Courier New"/>
-          <w:sz w:val="18"/>
-          <w:szCs w:val="18"/>
-        </w:rPr>
-        <w:t>/</w:t>
-      </w:r>
-      <w:proofErr w:type="spellStart"/>
-      <w:r>
-        <w:rPr>
-          <w:rFonts w:ascii="Courier New" w:eastAsia="Courier New" w:hAnsi="Courier New" w:cs="Courier New"/>
-          <w:sz w:val="18"/>
-          <w:szCs w:val="18"/>
-        </w:rPr>
-        <w:t>MemWrite</w:t>
-      </w:r>
-      <w:proofErr w:type="spellEnd"/>
-      <w:r>
-        <w:rPr>
-          <w:rFonts w:ascii="Courier New" w:eastAsia="Courier New" w:hAnsi="Courier New" w:cs="Courier New"/>
-          <w:sz w:val="18"/>
-          <w:szCs w:val="18"/>
-        </w:rPr>
-        <w:t xml:space="preserve">                     │           │          ▼       ▼                     │           └───► MUX ──► Write-</w:t>
-      </w:r>
-      <w:proofErr w:type="spellStart"/>
-      <w:r>
-        <w:rPr>
-          <w:rFonts w:ascii="Courier New" w:eastAsia="Courier New" w:hAnsi="Courier New" w:cs="Courier New"/>
-          <w:sz w:val="18"/>
-          <w:szCs w:val="18"/>
-        </w:rPr>
-        <w:t>back</w:t>
-      </w:r>
-      <w:proofErr w:type="spellEnd"/>
-      <w:r>
-        <w:rPr>
-          <w:rFonts w:ascii="Courier New" w:eastAsia="Courier New" w:hAnsi="Courier New" w:cs="Courier New"/>
-          <w:sz w:val="18"/>
-          <w:szCs w:val="18"/>
-        </w:rPr>
-        <w:t xml:space="preserve"> → Banco de Registradores                     │                     └── Branch/Jump </w:t>
-      </w:r>
-      <w:proofErr w:type="spellStart"/>
-      <w:r>
-        <w:rPr>
-          <w:rFonts w:ascii="Courier New" w:eastAsia="Courier New" w:hAnsi="Courier New" w:cs="Courier New"/>
-          <w:sz w:val="18"/>
-          <w:szCs w:val="18"/>
-        </w:rPr>
-        <w:t>Logic</w:t>
-      </w:r>
-      <w:proofErr w:type="spellEnd"/>
-      <w:r>
-        <w:rPr>
-          <w:rFonts w:ascii="Courier New" w:eastAsia="Courier New" w:hAnsi="Courier New" w:cs="Courier New"/>
-          <w:sz w:val="18"/>
-          <w:szCs w:val="18"/>
-        </w:rPr>
-        <w:t xml:space="preserve"> ──► Next PC   </w:t>
-      </w:r>
+        <w:jc w:val="center"/>
+      </w:pPr>
+      <w:r>
+        <w:br/>
+      </w:r>
+      <w:r>
+        <w:drawing>
+          <wp:inline distT="0" distB="0" distL="0" distR="0" wp14:anchorId="2B86184E" wp14:editId="0B020CB2">
+            <wp:extent cx="5493144" cy="7011670"/>
+            <wp:effectExtent l="0" t="0" r="0" b="0"/>
+            <wp:docPr id="1074435355" name="Imagem 2"/>
+            <wp:cNvGraphicFramePr>
+              <a:graphicFrameLocks xmlns:a="http://schemas.openxmlformats.org/drawingml/2006/main" noChangeAspect="1"/>
+            </wp:cNvGraphicFramePr>
+            <a:graphic xmlns:a="http://schemas.openxmlformats.org/drawingml/2006/main">
+              <a:graphicData uri="http://schemas.openxmlformats.org/drawingml/2006/picture">
+                <pic:pic xmlns:pic="http://schemas.openxmlformats.org/drawingml/2006/picture">
+                  <pic:nvPicPr>
+                    <pic:cNvPr id="0" name="Picture 6"/>
+                    <pic:cNvPicPr>
+                      <a:picLocks noChangeAspect="1" noChangeArrowheads="1"/>
+                    </pic:cNvPicPr>
+                  </pic:nvPicPr>
+                  <pic:blipFill>
+                    <a:blip r:embed="rId6" cstate="print">
+                      <a:extLst>
+                        <a:ext uri="{28A0092B-C50C-407E-A947-70E740481C1C}">
+                          <a14:useLocalDpi xmlns:a14="http://schemas.microsoft.com/office/drawing/2010/main" val="0"/>
+                        </a:ext>
+                      </a:extLst>
+                    </a:blip>
+                    <a:srcRect/>
+                    <a:stretch>
+                      <a:fillRect/>
+                    </a:stretch>
+                  </pic:blipFill>
+                  <pic:spPr bwMode="auto">
+                    <a:xfrm>
+                      <a:off x="0" y="0"/>
+                      <a:ext cx="5499924" cy="7020325"/>
+                    </a:xfrm>
+                    <a:prstGeom prst="rect">
+                      <a:avLst/>
+                    </a:prstGeom>
+                    <a:noFill/>
+                    <a:ln>
+                      <a:noFill/>
+                    </a:ln>
+                  </pic:spPr>
+                </pic:pic>
+              </a:graphicData>
+            </a:graphic>
+          </wp:inline>
+        </w:drawing>
+      </w:r>
+    </w:p>
+    <w:p>
+      <w:pPr>
+        <w:spacing w:after="60"/>
+      </w:pPr>
     </w:p>
     <w:p>
       <w:pPr>
@@ -1070,12 +912,6 @@
         <w:gridCol w:w="9000"/>
       </w:tblGrid>
       <w:tr>
-        <w:tblPrEx>
-          <w:tblCellMar>
-            <w:top w:w="0" w:type="dxa"/>
-            <w:bottom w:w="0" w:type="dxa"/>
-          </w:tblCellMar>
-        </w:tblPrEx>
         <w:tc>
           <w:tcPr>
             <w:tcW w:w="9000" w:type="dxa"/>
@@ -1522,12 +1358,6 @@
         <w:gridCol w:w="5200"/>
       </w:tblGrid>
       <w:tr>
-        <w:tblPrEx>
-          <w:tblCellMar>
-            <w:top w:w="0" w:type="dxa"/>
-            <w:bottom w:w="0" w:type="dxa"/>
-          </w:tblCellMar>
-        </w:tblPrEx>
         <w:trPr>
           <w:tblHeader/>
         </w:trPr>
@@ -1591,12 +1421,6 @@
         </w:tc>
       </w:tr>
       <w:tr>
-        <w:tblPrEx>
-          <w:tblCellMar>
-            <w:top w:w="0" w:type="dxa"/>
-            <w:bottom w:w="0" w:type="dxa"/>
-          </w:tblCellMar>
-        </w:tblPrEx>
         <w:tc>
           <w:tcPr>
             <w:tcW w:w="3800" w:type="dxa"/>
@@ -1653,12 +1477,6 @@
         </w:tc>
       </w:tr>
       <w:tr>
-        <w:tblPrEx>
-          <w:tblCellMar>
-            <w:top w:w="0" w:type="dxa"/>
-            <w:bottom w:w="0" w:type="dxa"/>
-          </w:tblCellMar>
-        </w:tblPrEx>
         <w:tc>
           <w:tcPr>
             <w:tcW w:w="3800" w:type="dxa"/>
@@ -1715,12 +1533,6 @@
         </w:tc>
       </w:tr>
       <w:tr>
-        <w:tblPrEx>
-          <w:tblCellMar>
-            <w:top w:w="0" w:type="dxa"/>
-            <w:bottom w:w="0" w:type="dxa"/>
-          </w:tblCellMar>
-        </w:tblPrEx>
         <w:tc>
           <w:tcPr>
             <w:tcW w:w="3800" w:type="dxa"/>
@@ -1777,12 +1589,6 @@
         </w:tc>
       </w:tr>
       <w:tr>
-        <w:tblPrEx>
-          <w:tblCellMar>
-            <w:top w:w="0" w:type="dxa"/>
-            <w:bottom w:w="0" w:type="dxa"/>
-          </w:tblCellMar>
-        </w:tblPrEx>
         <w:tc>
           <w:tcPr>
             <w:tcW w:w="3800" w:type="dxa"/>
@@ -1839,12 +1645,6 @@
         </w:tc>
       </w:tr>
       <w:tr>
-        <w:tblPrEx>
-          <w:tblCellMar>
-            <w:top w:w="0" w:type="dxa"/>
-            <w:bottom w:w="0" w:type="dxa"/>
-          </w:tblCellMar>
-        </w:tblPrEx>
         <w:tc>
           <w:tcPr>
             <w:tcW w:w="3800" w:type="dxa"/>
@@ -1977,12 +1777,6 @@
         <w:gridCol w:w="5686"/>
       </w:tblGrid>
       <w:tr>
-        <w:tblPrEx>
-          <w:tblCellMar>
-            <w:top w:w="0" w:type="dxa"/>
-            <w:bottom w:w="0" w:type="dxa"/>
-          </w:tblCellMar>
-        </w:tblPrEx>
         <w:trPr>
           <w:tblHeader/>
         </w:trPr>
@@ -2104,12 +1898,6 @@
         </w:tc>
       </w:tr>
       <w:tr>
-        <w:tblPrEx>
-          <w:tblCellMar>
-            <w:top w:w="0" w:type="dxa"/>
-            <w:bottom w:w="0" w:type="dxa"/>
-          </w:tblCellMar>
-        </w:tblPrEx>
         <w:tc>
           <w:tcPr>
             <w:tcW w:w="1500" w:type="dxa"/>
@@ -2222,12 +2010,6 @@
         </w:tc>
       </w:tr>
       <w:tr>
-        <w:tblPrEx>
-          <w:tblCellMar>
-            <w:top w:w="0" w:type="dxa"/>
-            <w:bottom w:w="0" w:type="dxa"/>
-          </w:tblCellMar>
-        </w:tblPrEx>
         <w:tc>
           <w:tcPr>
             <w:tcW w:w="1500" w:type="dxa"/>
@@ -2340,12 +2122,6 @@
         </w:tc>
       </w:tr>
       <w:tr>
-        <w:tblPrEx>
-          <w:tblCellMar>
-            <w:top w:w="0" w:type="dxa"/>
-            <w:bottom w:w="0" w:type="dxa"/>
-          </w:tblCellMar>
-        </w:tblPrEx>
         <w:tc>
           <w:tcPr>
             <w:tcW w:w="1500" w:type="dxa"/>
@@ -2467,12 +2243,6 @@
         </w:tc>
       </w:tr>
       <w:tr>
-        <w:tblPrEx>
-          <w:tblCellMar>
-            <w:top w:w="0" w:type="dxa"/>
-            <w:bottom w:w="0" w:type="dxa"/>
-          </w:tblCellMar>
-        </w:tblPrEx>
         <w:tc>
           <w:tcPr>
             <w:tcW w:w="1500" w:type="dxa"/>
@@ -2592,12 +2362,6 @@
         </w:tc>
       </w:tr>
       <w:tr>
-        <w:tblPrEx>
-          <w:tblCellMar>
-            <w:top w:w="0" w:type="dxa"/>
-            <w:bottom w:w="0" w:type="dxa"/>
-          </w:tblCellMar>
-        </w:tblPrEx>
         <w:tc>
           <w:tcPr>
             <w:tcW w:w="1500" w:type="dxa"/>
@@ -2727,12 +2491,6 @@
         </w:tc>
       </w:tr>
       <w:tr>
-        <w:tblPrEx>
-          <w:tblCellMar>
-            <w:top w:w="0" w:type="dxa"/>
-            <w:bottom w:w="0" w:type="dxa"/>
-          </w:tblCellMar>
-        </w:tblPrEx>
         <w:tc>
           <w:tcPr>
             <w:tcW w:w="1500" w:type="dxa"/>
@@ -2861,12 +2619,6 @@
         </w:tc>
       </w:tr>
       <w:tr>
-        <w:tblPrEx>
-          <w:tblCellMar>
-            <w:top w:w="0" w:type="dxa"/>
-            <w:bottom w:w="0" w:type="dxa"/>
-          </w:tblCellMar>
-        </w:tblPrEx>
         <w:tc>
           <w:tcPr>
             <w:tcW w:w="1500" w:type="dxa"/>
@@ -3217,12 +2969,6 @@
         <w:gridCol w:w="6060"/>
       </w:tblGrid>
       <w:tr>
-        <w:tblPrEx>
-          <w:tblCellMar>
-            <w:top w:w="0" w:type="dxa"/>
-            <w:bottom w:w="0" w:type="dxa"/>
-          </w:tblCellMar>
-        </w:tblPrEx>
         <w:trPr>
           <w:tblHeader/>
         </w:trPr>
@@ -3318,12 +3064,6 @@
         </w:tc>
       </w:tr>
       <w:tr>
-        <w:tblPrEx>
-          <w:tblCellMar>
-            <w:top w:w="0" w:type="dxa"/>
-            <w:bottom w:w="0" w:type="dxa"/>
-          </w:tblCellMar>
-        </w:tblPrEx>
         <w:tc>
           <w:tcPr>
             <w:tcW w:w="2200" w:type="dxa"/>
@@ -3457,12 +3197,6 @@
         </w:tc>
       </w:tr>
       <w:tr>
-        <w:tblPrEx>
-          <w:tblCellMar>
-            <w:top w:w="0" w:type="dxa"/>
-            <w:bottom w:w="0" w:type="dxa"/>
-          </w:tblCellMar>
-        </w:tblPrEx>
         <w:tc>
           <w:tcPr>
             <w:tcW w:w="2200" w:type="dxa"/>
@@ -3548,12 +3282,6 @@
         </w:tc>
       </w:tr>
       <w:tr>
-        <w:tblPrEx>
-          <w:tblCellMar>
-            <w:top w:w="0" w:type="dxa"/>
-            <w:bottom w:w="0" w:type="dxa"/>
-          </w:tblCellMar>
-        </w:tblPrEx>
         <w:tc>
           <w:tcPr>
             <w:tcW w:w="2200" w:type="dxa"/>
@@ -3639,12 +3367,6 @@
         </w:tc>
       </w:tr>
       <w:tr>
-        <w:tblPrEx>
-          <w:tblCellMar>
-            <w:top w:w="0" w:type="dxa"/>
-            <w:bottom w:w="0" w:type="dxa"/>
-          </w:tblCellMar>
-        </w:tblPrEx>
         <w:tc>
           <w:tcPr>
             <w:tcW w:w="2200" w:type="dxa"/>
@@ -3746,12 +3468,6 @@
         </w:tc>
       </w:tr>
       <w:tr>
-        <w:tblPrEx>
-          <w:tblCellMar>
-            <w:top w:w="0" w:type="dxa"/>
-            <w:bottom w:w="0" w:type="dxa"/>
-          </w:tblCellMar>
-        </w:tblPrEx>
         <w:tc>
           <w:tcPr>
             <w:tcW w:w="2200" w:type="dxa"/>
@@ -3862,12 +3578,6 @@
         </w:tc>
       </w:tr>
       <w:tr>
-        <w:tblPrEx>
-          <w:tblCellMar>
-            <w:top w:w="0" w:type="dxa"/>
-            <w:bottom w:w="0" w:type="dxa"/>
-          </w:tblCellMar>
-        </w:tblPrEx>
         <w:tc>
           <w:tcPr>
             <w:tcW w:w="2200" w:type="dxa"/>
@@ -3953,12 +3663,6 @@
         </w:tc>
       </w:tr>
       <w:tr>
-        <w:tblPrEx>
-          <w:tblCellMar>
-            <w:top w:w="0" w:type="dxa"/>
-            <w:bottom w:w="0" w:type="dxa"/>
-          </w:tblCellMar>
-        </w:tblPrEx>
         <w:tc>
           <w:tcPr>
             <w:tcW w:w="2200" w:type="dxa"/>
@@ -4042,12 +3746,6 @@
         </w:tc>
       </w:tr>
       <w:tr>
-        <w:tblPrEx>
-          <w:tblCellMar>
-            <w:top w:w="0" w:type="dxa"/>
-            <w:bottom w:w="0" w:type="dxa"/>
-          </w:tblCellMar>
-        </w:tblPrEx>
         <w:tc>
           <w:tcPr>
             <w:tcW w:w="2200" w:type="dxa"/>
@@ -4131,12 +3829,6 @@
         </w:tc>
       </w:tr>
       <w:tr>
-        <w:tblPrEx>
-          <w:tblCellMar>
-            <w:top w:w="0" w:type="dxa"/>
-            <w:bottom w:w="0" w:type="dxa"/>
-          </w:tblCellMar>
-        </w:tblPrEx>
         <w:tc>
           <w:tcPr>
             <w:tcW w:w="2200" w:type="dxa"/>
@@ -4654,12 +4346,6 @@
         <w:gridCol w:w="2460"/>
       </w:tblGrid>
       <w:tr>
-        <w:tblPrEx>
-          <w:tblCellMar>
-            <w:top w:w="0" w:type="dxa"/>
-            <w:bottom w:w="0" w:type="dxa"/>
-          </w:tblCellMar>
-        </w:tblPrEx>
         <w:trPr>
           <w:tblHeader/>
         </w:trPr>
@@ -4781,12 +4467,6 @@
         </w:tc>
       </w:tr>
       <w:tr>
-        <w:tblPrEx>
-          <w:tblCellMar>
-            <w:top w:w="0" w:type="dxa"/>
-            <w:bottom w:w="0" w:type="dxa"/>
-          </w:tblCellMar>
-        </w:tblPrEx>
         <w:tc>
           <w:tcPr>
             <w:tcW w:w="2000" w:type="dxa"/>
@@ -4949,12 +4629,6 @@
         </w:tc>
       </w:tr>
       <w:tr>
-        <w:tblPrEx>
-          <w:tblCellMar>
-            <w:top w:w="0" w:type="dxa"/>
-            <w:bottom w:w="0" w:type="dxa"/>
-          </w:tblCellMar>
-        </w:tblPrEx>
         <w:tc>
           <w:tcPr>
             <w:tcW w:w="2000" w:type="dxa"/>
@@ -5076,12 +4750,6 @@
         </w:tc>
       </w:tr>
       <w:tr>
-        <w:tblPrEx>
-          <w:tblCellMar>
-            <w:top w:w="0" w:type="dxa"/>
-            <w:bottom w:w="0" w:type="dxa"/>
-          </w:tblCellMar>
-        </w:tblPrEx>
         <w:tc>
           <w:tcPr>
             <w:tcW w:w="2000" w:type="dxa"/>
@@ -5196,12 +4864,6 @@
         </w:tc>
       </w:tr>
       <w:tr>
-        <w:tblPrEx>
-          <w:tblCellMar>
-            <w:top w:w="0" w:type="dxa"/>
-            <w:bottom w:w="0" w:type="dxa"/>
-          </w:tblCellMar>
-        </w:tblPrEx>
         <w:tc>
           <w:tcPr>
             <w:tcW w:w="2000" w:type="dxa"/>
@@ -5316,12 +4978,6 @@
         </w:tc>
       </w:tr>
       <w:tr>
-        <w:tblPrEx>
-          <w:tblCellMar>
-            <w:top w:w="0" w:type="dxa"/>
-            <w:bottom w:w="0" w:type="dxa"/>
-          </w:tblCellMar>
-        </w:tblPrEx>
         <w:tc>
           <w:tcPr>
             <w:tcW w:w="2000" w:type="dxa"/>
@@ -5459,12 +5115,6 @@
         </w:tc>
       </w:tr>
       <w:tr>
-        <w:tblPrEx>
-          <w:tblCellMar>
-            <w:top w:w="0" w:type="dxa"/>
-            <w:bottom w:w="0" w:type="dxa"/>
-          </w:tblCellMar>
-        </w:tblPrEx>
         <w:tc>
           <w:tcPr>
             <w:tcW w:w="2000" w:type="dxa"/>
@@ -5602,12 +5252,6 @@
         </w:tc>
       </w:tr>
       <w:tr>
-        <w:tblPrEx>
-          <w:tblCellMar>
-            <w:top w:w="0" w:type="dxa"/>
-            <w:bottom w:w="0" w:type="dxa"/>
-          </w:tblCellMar>
-        </w:tblPrEx>
         <w:tc>
           <w:tcPr>
             <w:tcW w:w="2000" w:type="dxa"/>
@@ -5738,12 +5382,6 @@
         </w:tc>
       </w:tr>
       <w:tr>
-        <w:tblPrEx>
-          <w:tblCellMar>
-            <w:top w:w="0" w:type="dxa"/>
-            <w:bottom w:w="0" w:type="dxa"/>
-          </w:tblCellMar>
-        </w:tblPrEx>
         <w:tc>
           <w:tcPr>
             <w:tcW w:w="2000" w:type="dxa"/>
@@ -6224,12 +5862,6 @@
         <w:gridCol w:w="5200"/>
       </w:tblGrid>
       <w:tr>
-        <w:tblPrEx>
-          <w:tblCellMar>
-            <w:top w:w="0" w:type="dxa"/>
-            <w:bottom w:w="0" w:type="dxa"/>
-          </w:tblCellMar>
-        </w:tblPrEx>
         <w:trPr>
           <w:tblHeader/>
         </w:trPr>
@@ -6293,12 +5925,6 @@
         </w:tc>
       </w:tr>
       <w:tr>
-        <w:tblPrEx>
-          <w:tblCellMar>
-            <w:top w:w="0" w:type="dxa"/>
-            <w:bottom w:w="0" w:type="dxa"/>
-          </w:tblCellMar>
-        </w:tblPrEx>
         <w:tc>
           <w:tcPr>
             <w:tcW w:w="3800" w:type="dxa"/>
@@ -6355,12 +5981,6 @@
         </w:tc>
       </w:tr>
       <w:tr>
-        <w:tblPrEx>
-          <w:tblCellMar>
-            <w:top w:w="0" w:type="dxa"/>
-            <w:bottom w:w="0" w:type="dxa"/>
-          </w:tblCellMar>
-        </w:tblPrEx>
         <w:tc>
           <w:tcPr>
             <w:tcW w:w="3800" w:type="dxa"/>
@@ -6417,12 +6037,6 @@
         </w:tc>
       </w:tr>
       <w:tr>
-        <w:tblPrEx>
-          <w:tblCellMar>
-            <w:top w:w="0" w:type="dxa"/>
-            <w:bottom w:w="0" w:type="dxa"/>
-          </w:tblCellMar>
-        </w:tblPrEx>
         <w:tc>
           <w:tcPr>
             <w:tcW w:w="3800" w:type="dxa"/>
@@ -6479,12 +6093,6 @@
         </w:tc>
       </w:tr>
       <w:tr>
-        <w:tblPrEx>
-          <w:tblCellMar>
-            <w:top w:w="0" w:type="dxa"/>
-            <w:bottom w:w="0" w:type="dxa"/>
-          </w:tblCellMar>
-        </w:tblPrEx>
         <w:tc>
           <w:tcPr>
             <w:tcW w:w="3800" w:type="dxa"/>
@@ -6557,12 +6165,6 @@
         </w:tc>
       </w:tr>
       <w:tr>
-        <w:tblPrEx>
-          <w:tblCellMar>
-            <w:top w:w="0" w:type="dxa"/>
-            <w:bottom w:w="0" w:type="dxa"/>
-          </w:tblCellMar>
-        </w:tblPrEx>
         <w:tc>
           <w:tcPr>
             <w:tcW w:w="3800" w:type="dxa"/>
@@ -6637,12 +6239,6 @@
         </w:tc>
       </w:tr>
       <w:tr>
-        <w:tblPrEx>
-          <w:tblCellMar>
-            <w:top w:w="0" w:type="dxa"/>
-            <w:bottom w:w="0" w:type="dxa"/>
-          </w:tblCellMar>
-        </w:tblPrEx>
         <w:tc>
           <w:tcPr>
             <w:tcW w:w="3800" w:type="dxa"/>
@@ -6841,12 +6437,6 @@
         <w:gridCol w:w="2253"/>
       </w:tblGrid>
       <w:tr>
-        <w:tblPrEx>
-          <w:tblCellMar>
-            <w:top w:w="0" w:type="dxa"/>
-            <w:bottom w:w="0" w:type="dxa"/>
-          </w:tblCellMar>
-        </w:tblPrEx>
         <w:trPr>
           <w:tblHeader/>
         </w:trPr>
@@ -7032,12 +6622,6 @@
         </w:tc>
       </w:tr>
       <w:tr>
-        <w:tblPrEx>
-          <w:tblCellMar>
-            <w:top w:w="0" w:type="dxa"/>
-            <w:bottom w:w="0" w:type="dxa"/>
-          </w:tblCellMar>
-        </w:tblPrEx>
         <w:tc>
           <w:tcPr>
             <w:tcW w:w="1400" w:type="dxa"/>
@@ -7254,12 +6838,6 @@
         </w:tc>
       </w:tr>
       <w:tr>
-        <w:tblPrEx>
-          <w:tblCellMar>
-            <w:top w:w="0" w:type="dxa"/>
-            <w:bottom w:w="0" w:type="dxa"/>
-          </w:tblCellMar>
-        </w:tblPrEx>
         <w:tc>
           <w:tcPr>
             <w:tcW w:w="1400" w:type="dxa"/>
@@ -7444,12 +7022,6 @@
         </w:tc>
       </w:tr>
       <w:tr>
-        <w:tblPrEx>
-          <w:tblCellMar>
-            <w:top w:w="0" w:type="dxa"/>
-            <w:bottom w:w="0" w:type="dxa"/>
-          </w:tblCellMar>
-        </w:tblPrEx>
         <w:tc>
           <w:tcPr>
             <w:tcW w:w="1400" w:type="dxa"/>
@@ -7643,12 +7215,6 @@
         </w:tc>
       </w:tr>
       <w:tr>
-        <w:tblPrEx>
-          <w:tblCellMar>
-            <w:top w:w="0" w:type="dxa"/>
-            <w:bottom w:w="0" w:type="dxa"/>
-          </w:tblCellMar>
-        </w:tblPrEx>
         <w:tc>
           <w:tcPr>
             <w:tcW w:w="1400" w:type="dxa"/>
@@ -8021,12 +7587,6 @@
         <w:gridCol w:w="1740"/>
       </w:tblGrid>
       <w:tr>
-        <w:tblPrEx>
-          <w:tblCellMar>
-            <w:top w:w="0" w:type="dxa"/>
-            <w:bottom w:w="0" w:type="dxa"/>
-          </w:tblCellMar>
-        </w:tblPrEx>
         <w:trPr>
           <w:tblHeader/>
         </w:trPr>
@@ -8119,12 +7679,6 @@
         </w:tc>
       </w:tr>
       <w:tr>
-        <w:tblPrEx>
-          <w:tblCellMar>
-            <w:top w:w="0" w:type="dxa"/>
-            <w:bottom w:w="0" w:type="dxa"/>
-          </w:tblCellMar>
-        </w:tblPrEx>
         <w:tc>
           <w:tcPr>
             <w:tcW w:w="1500" w:type="dxa"/>
@@ -8258,284 +7812,6 @@
                 <w:szCs w:val="20"/>
               </w:rPr>
               <w:t>(3)</w:t>
-            </w:r>
-          </w:p>
-        </w:tc>
-        <w:tc>
-          <w:tcPr>
-            <w:tcW w:w="1740" w:type="dxa"/>
-            <w:tcBorders>
-              <w:top w:val="single" w:sz="1" w:space="0" w:color="AAAAAA"/>
-              <w:left w:val="single" w:sz="1" w:space="0" w:color="AAAAAA"/>
-              <w:bottom w:val="single" w:sz="1" w:space="0" w:color="AAAAAA"/>
-              <w:right w:val="single" w:sz="1" w:space="0" w:color="AAAAAA"/>
-            </w:tcBorders>
-            <w:shd w:val="clear" w:color="auto" w:fill="FFFFFF"/>
-            <w:tcMar>
-              <w:top w:w="80" w:type="dxa"/>
-              <w:left w:w="120" w:type="dxa"/>
-              <w:bottom w:w="80" w:type="dxa"/>
-              <w:right w:w="120" w:type="dxa"/>
-            </w:tcMar>
-          </w:tcPr>
-          <w:p>
-            <w:r>
-              <w:rPr>
-                <w:sz w:val="20"/>
-                <w:szCs w:val="20"/>
-              </w:rPr>
-              <w:t>18 bits</w:t>
-            </w:r>
-          </w:p>
-        </w:tc>
-      </w:tr>
-      <w:tr>
-        <w:tblPrEx>
-          <w:tblCellMar>
-            <w:top w:w="0" w:type="dxa"/>
-            <w:bottom w:w="0" w:type="dxa"/>
-          </w:tblCellMar>
-        </w:tblPrEx>
-        <w:tc>
-          <w:tcPr>
-            <w:tcW w:w="1500" w:type="dxa"/>
-            <w:tcBorders>
-              <w:top w:val="single" w:sz="1" w:space="0" w:color="AAAAAA"/>
-              <w:left w:val="single" w:sz="1" w:space="0" w:color="AAAAAA"/>
-              <w:bottom w:val="single" w:sz="1" w:space="0" w:color="AAAAAA"/>
-              <w:right w:val="single" w:sz="1" w:space="0" w:color="AAAAAA"/>
-            </w:tcBorders>
-            <w:shd w:val="clear" w:color="auto" w:fill="F2F2F2"/>
-            <w:tcMar>
-              <w:top w:w="80" w:type="dxa"/>
-              <w:left w:w="120" w:type="dxa"/>
-              <w:bottom w:w="80" w:type="dxa"/>
-              <w:right w:w="120" w:type="dxa"/>
-            </w:tcMar>
-          </w:tcPr>
-          <w:p>
-            <w:r>
-              <w:rPr>
-                <w:sz w:val="20"/>
-                <w:szCs w:val="20"/>
-              </w:rPr>
-              <w:t>I-</w:t>
-            </w:r>
-            <w:proofErr w:type="spellStart"/>
-            <w:r>
-              <w:rPr>
-                <w:sz w:val="20"/>
-                <w:szCs w:val="20"/>
-              </w:rPr>
-              <w:t>type</w:t>
-            </w:r>
-            <w:proofErr w:type="spellEnd"/>
-          </w:p>
-        </w:tc>
-        <w:tc>
-          <w:tcPr>
-            <w:tcW w:w="5760" w:type="dxa"/>
-            <w:tcBorders>
-              <w:top w:val="single" w:sz="1" w:space="0" w:color="AAAAAA"/>
-              <w:left w:val="single" w:sz="1" w:space="0" w:color="AAAAAA"/>
-              <w:bottom w:val="single" w:sz="1" w:space="0" w:color="AAAAAA"/>
-              <w:right w:val="single" w:sz="1" w:space="0" w:color="AAAAAA"/>
-            </w:tcBorders>
-            <w:shd w:val="clear" w:color="auto" w:fill="F2F2F2"/>
-            <w:tcMar>
-              <w:top w:w="80" w:type="dxa"/>
-              <w:left w:w="120" w:type="dxa"/>
-              <w:bottom w:w="80" w:type="dxa"/>
-              <w:right w:w="120" w:type="dxa"/>
-            </w:tcMar>
-          </w:tcPr>
-          <w:p>
-            <w:proofErr w:type="spellStart"/>
-            <w:r>
-              <w:rPr>
-                <w:sz w:val="20"/>
-                <w:szCs w:val="20"/>
-              </w:rPr>
-              <w:t>opcode</w:t>
-            </w:r>
-            <w:proofErr w:type="spellEnd"/>
-            <w:r>
-              <w:rPr>
-                <w:sz w:val="20"/>
-                <w:szCs w:val="20"/>
-              </w:rPr>
-              <w:t xml:space="preserve">(3) | </w:t>
-            </w:r>
-            <w:proofErr w:type="spellStart"/>
-            <w:r>
-              <w:rPr>
-                <w:sz w:val="20"/>
-                <w:szCs w:val="20"/>
-              </w:rPr>
-              <w:t>rs</w:t>
-            </w:r>
-            <w:proofErr w:type="spellEnd"/>
-            <w:r>
-              <w:rPr>
-                <w:sz w:val="20"/>
-                <w:szCs w:val="20"/>
-              </w:rPr>
-              <w:t xml:space="preserve">(3) | </w:t>
-            </w:r>
-            <w:proofErr w:type="spellStart"/>
-            <w:r>
-              <w:rPr>
-                <w:sz w:val="20"/>
-                <w:szCs w:val="20"/>
-              </w:rPr>
-              <w:t>rt</w:t>
-            </w:r>
-            <w:proofErr w:type="spellEnd"/>
-            <w:r>
-              <w:rPr>
-                <w:sz w:val="20"/>
-                <w:szCs w:val="20"/>
-              </w:rPr>
-              <w:t xml:space="preserve">(3) | </w:t>
-            </w:r>
-            <w:proofErr w:type="spellStart"/>
-            <w:r>
-              <w:rPr>
-                <w:sz w:val="20"/>
-                <w:szCs w:val="20"/>
-              </w:rPr>
-              <w:t>imm</w:t>
-            </w:r>
-            <w:proofErr w:type="spellEnd"/>
-            <w:r>
-              <w:rPr>
-                <w:sz w:val="20"/>
-                <w:szCs w:val="20"/>
-              </w:rPr>
-              <w:t>(9)</w:t>
-            </w:r>
-          </w:p>
-        </w:tc>
-        <w:tc>
-          <w:tcPr>
-            <w:tcW w:w="1740" w:type="dxa"/>
-            <w:tcBorders>
-              <w:top w:val="single" w:sz="1" w:space="0" w:color="AAAAAA"/>
-              <w:left w:val="single" w:sz="1" w:space="0" w:color="AAAAAA"/>
-              <w:bottom w:val="single" w:sz="1" w:space="0" w:color="AAAAAA"/>
-              <w:right w:val="single" w:sz="1" w:space="0" w:color="AAAAAA"/>
-            </w:tcBorders>
-            <w:shd w:val="clear" w:color="auto" w:fill="F2F2F2"/>
-            <w:tcMar>
-              <w:top w:w="80" w:type="dxa"/>
-              <w:left w:w="120" w:type="dxa"/>
-              <w:bottom w:w="80" w:type="dxa"/>
-              <w:right w:w="120" w:type="dxa"/>
-            </w:tcMar>
-          </w:tcPr>
-          <w:p>
-            <w:r>
-              <w:rPr>
-                <w:sz w:val="20"/>
-                <w:szCs w:val="20"/>
-              </w:rPr>
-              <w:t>18 bits</w:t>
-            </w:r>
-          </w:p>
-        </w:tc>
-      </w:tr>
-      <w:tr>
-        <w:tblPrEx>
-          <w:tblCellMar>
-            <w:top w:w="0" w:type="dxa"/>
-            <w:bottom w:w="0" w:type="dxa"/>
-          </w:tblCellMar>
-        </w:tblPrEx>
-        <w:tc>
-          <w:tcPr>
-            <w:tcW w:w="1500" w:type="dxa"/>
-            <w:tcBorders>
-              <w:top w:val="single" w:sz="1" w:space="0" w:color="AAAAAA"/>
-              <w:left w:val="single" w:sz="1" w:space="0" w:color="AAAAAA"/>
-              <w:bottom w:val="single" w:sz="1" w:space="0" w:color="AAAAAA"/>
-              <w:right w:val="single" w:sz="1" w:space="0" w:color="AAAAAA"/>
-            </w:tcBorders>
-            <w:shd w:val="clear" w:color="auto" w:fill="FFFFFF"/>
-            <w:tcMar>
-              <w:top w:w="80" w:type="dxa"/>
-              <w:left w:w="120" w:type="dxa"/>
-              <w:bottom w:w="80" w:type="dxa"/>
-              <w:right w:w="120" w:type="dxa"/>
-            </w:tcMar>
-          </w:tcPr>
-          <w:p>
-            <w:r>
-              <w:rPr>
-                <w:sz w:val="20"/>
-                <w:szCs w:val="20"/>
-              </w:rPr>
-              <w:t>J-</w:t>
-            </w:r>
-            <w:proofErr w:type="spellStart"/>
-            <w:r>
-              <w:rPr>
-                <w:sz w:val="20"/>
-                <w:szCs w:val="20"/>
-              </w:rPr>
-              <w:t>type</w:t>
-            </w:r>
-            <w:proofErr w:type="spellEnd"/>
-          </w:p>
-        </w:tc>
-        <w:tc>
-          <w:tcPr>
-            <w:tcW w:w="5760" w:type="dxa"/>
-            <w:tcBorders>
-              <w:top w:val="single" w:sz="1" w:space="0" w:color="AAAAAA"/>
-              <w:left w:val="single" w:sz="1" w:space="0" w:color="AAAAAA"/>
-              <w:bottom w:val="single" w:sz="1" w:space="0" w:color="AAAAAA"/>
-              <w:right w:val="single" w:sz="1" w:space="0" w:color="AAAAAA"/>
-            </w:tcBorders>
-            <w:shd w:val="clear" w:color="auto" w:fill="FFFFFF"/>
-            <w:tcMar>
-              <w:top w:w="80" w:type="dxa"/>
-              <w:left w:w="120" w:type="dxa"/>
-              <w:bottom w:w="80" w:type="dxa"/>
-              <w:right w:w="120" w:type="dxa"/>
-            </w:tcMar>
-          </w:tcPr>
-          <w:p>
-            <w:proofErr w:type="spellStart"/>
-            <w:r>
-              <w:rPr>
-                <w:sz w:val="20"/>
-                <w:szCs w:val="20"/>
-              </w:rPr>
-              <w:t>opcode</w:t>
-            </w:r>
-            <w:proofErr w:type="spellEnd"/>
-            <w:r>
-              <w:rPr>
-                <w:sz w:val="20"/>
-                <w:szCs w:val="20"/>
-              </w:rPr>
-              <w:t xml:space="preserve">(3) | </w:t>
-            </w:r>
-            <w:proofErr w:type="spellStart"/>
-            <w:r>
-              <w:rPr>
-                <w:sz w:val="20"/>
-                <w:szCs w:val="20"/>
-              </w:rPr>
-              <w:t>addr</w:t>
-            </w:r>
-            <w:proofErr w:type="spellEnd"/>
-            <w:r>
-              <w:rPr>
-                <w:sz w:val="20"/>
-                <w:szCs w:val="20"/>
-              </w:rPr>
-              <w:t>(15)</w:t>
             </w:r>
           </w:p>
         </w:tc>
@@ -8569,20 +7845,6 @@
       </w:tr>
     </w:tbl>
     <w:p>
-      <w:pPr>
-        <w:spacing w:after="60"/>
-      </w:pPr>
-    </w:p>
-    <w:p>
-      <w:pPr>
-        <w:spacing w:before="60" w:after="80"/>
-        <w:jc w:val="both"/>
-      </w:pPr>
-      <w:r>
-        <w:t>A instrução de teste pré-carregada na ROM (0x38001) corresponde a uma instrução de soma imediata que serve para verificar o funcionamento básico do processador ao inicializar.</w:t>
-      </w:r>
-    </w:p>
-    <w:p>
       <w:r>
         <w:br w:type="page"/>
       </w:r>
@@ -8590,9 +7852,6 @@
     <w:p>
       <w:pPr>
         <w:pStyle w:val="Ttulo1"/>
-        <w:pBdr>
-          <w:bottom w:val="single" w:sz="8" w:space="4" w:color="2E74B5"/>
-        </w:pBdr>
         <w:rPr>
           <w:color w:val="auto"/>
         </w:rPr>
@@ -8659,12 +7918,6 @@
         <w:gridCol w:w="858"/>
       </w:tblGrid>
       <w:tr>
-        <w:tblPrEx>
-          <w:tblCellMar>
-            <w:top w:w="0" w:type="dxa"/>
-            <w:bottom w:w="0" w:type="dxa"/>
-          </w:tblCellMar>
-        </w:tblPrEx>
         <w:trPr>
           <w:tblHeader/>
         </w:trPr>
@@ -8974,12 +8227,6 @@
         </w:tc>
       </w:tr>
       <w:tr>
-        <w:tblPrEx>
-          <w:tblCellMar>
-            <w:top w:w="0" w:type="dxa"/>
-            <w:bottom w:w="0" w:type="dxa"/>
-          </w:tblCellMar>
-        </w:tblPrEx>
         <w:tc>
           <w:tcPr>
             <w:tcW w:w="900" w:type="dxa"/>
@@ -9268,12 +8515,6 @@
         </w:tc>
       </w:tr>
       <w:tr>
-        <w:tblPrEx>
-          <w:tblCellMar>
-            <w:top w:w="0" w:type="dxa"/>
-            <w:bottom w:w="0" w:type="dxa"/>
-          </w:tblCellMar>
-        </w:tblPrEx>
         <w:tc>
           <w:tcPr>
             <w:tcW w:w="900" w:type="dxa"/>
@@ -9571,12 +8812,6 @@
         </w:tc>
       </w:tr>
       <w:tr>
-        <w:tblPrEx>
-          <w:tblCellMar>
-            <w:top w:w="0" w:type="dxa"/>
-            <w:bottom w:w="0" w:type="dxa"/>
-          </w:tblCellMar>
-        </w:tblPrEx>
         <w:tc>
           <w:tcPr>
             <w:tcW w:w="900" w:type="dxa"/>
@@ -9890,12 +9125,6 @@
         </w:tc>
       </w:tr>
       <w:tr>
-        <w:tblPrEx>
-          <w:tblCellMar>
-            <w:top w:w="0" w:type="dxa"/>
-            <w:bottom w:w="0" w:type="dxa"/>
-          </w:tblCellMar>
-        </w:tblPrEx>
         <w:tc>
           <w:tcPr>
             <w:tcW w:w="900" w:type="dxa"/>
@@ -10177,12 +9406,6 @@
         </w:tc>
       </w:tr>
       <w:tr>
-        <w:tblPrEx>
-          <w:tblCellMar>
-            <w:top w:w="0" w:type="dxa"/>
-            <w:bottom w:w="0" w:type="dxa"/>
-          </w:tblCellMar>
-        </w:tblPrEx>
         <w:tc>
           <w:tcPr>
             <w:tcW w:w="900" w:type="dxa"/>
@@ -10464,12 +9687,6 @@
         </w:tc>
       </w:tr>
       <w:tr>
-        <w:tblPrEx>
-          <w:tblCellMar>
-            <w:top w:w="0" w:type="dxa"/>
-            <w:bottom w:w="0" w:type="dxa"/>
-          </w:tblCellMar>
-        </w:tblPrEx>
         <w:tc>
           <w:tcPr>
             <w:tcW w:w="900" w:type="dxa"/>
@@ -10742,12 +9959,6 @@
         </w:tc>
       </w:tr>
       <w:tr>
-        <w:tblPrEx>
-          <w:tblCellMar>
-            <w:top w:w="0" w:type="dxa"/>
-            <w:bottom w:w="0" w:type="dxa"/>
-          </w:tblCellMar>
-        </w:tblPrEx>
         <w:tc>
           <w:tcPr>
             <w:tcW w:w="900" w:type="dxa"/>
@@ -11467,7 +10678,15 @@
       </w:r>
       <w:proofErr w:type="spellEnd"/>
       <w:r>
-        <w:t xml:space="preserve"> do Logisim para conectar sinais entre módulos distantes sem fios longos:</w:t>
+        <w:t xml:space="preserve"> do </w:t>
+      </w:r>
+      <w:proofErr w:type="spellStart"/>
+      <w:r>
+        <w:t>Logisim</w:t>
+      </w:r>
+      <w:proofErr w:type="spellEnd"/>
+      <w:r>
+        <w:t xml:space="preserve"> para conectar sinais entre módulos distantes sem fios longos:</w:t>
       </w:r>
     </w:p>
     <w:p>
@@ -11781,7 +11000,15 @@
         <w:spacing w:before="40" w:after="40"/>
       </w:pPr>
       <w:r>
-        <w:t>Cada operação usa o componente aritmético nativo do Logisim (</w:t>
+        <w:t xml:space="preserve">Cada operação usa o componente aritmético nativo do </w:t>
+      </w:r>
+      <w:proofErr w:type="spellStart"/>
+      <w:r>
+        <w:t>Logisim</w:t>
+      </w:r>
+      <w:proofErr w:type="spellEnd"/>
+      <w:r>
+        <w:t xml:space="preserve"> (</w:t>
       </w:r>
       <w:proofErr w:type="spellStart"/>
       <w:r>
@@ -12960,7 +12187,6 @@
   <w:style w:type="character" w:default="1" w:styleId="Fontepargpadro">
     <w:name w:val="Default Paragraph Font"/>
     <w:uiPriority w:val="1"/>
-    <w:semiHidden/>
     <w:unhideWhenUsed/>
   </w:style>
   <w:style w:type="table" w:default="1" w:styleId="Tabelanormal">
@@ -13154,6 +12380,19 @@
     <w:rPr>
       <w:color w:val="605E5C"/>
       <w:shd w:val="clear" w:color="auto" w:fill="E1DFDD"/>
+    </w:rPr>
+  </w:style>
+  <w:style w:type="paragraph" w:styleId="NormalWeb">
+    <w:name w:val="Normal (Web)"/>
+    <w:basedOn w:val="Normal"/>
+    <w:uiPriority w:val="99"/>
+    <w:semiHidden/>
+    <w:unhideWhenUsed/>
+    <w:rsid w:val="00B704AC"/>
+    <w:rPr>
+      <w:rFonts w:ascii="Times New Roman" w:hAnsi="Times New Roman" w:cs="Times New Roman"/>
+      <w:sz w:val="24"/>
+      <w:szCs w:val="24"/>
     </w:rPr>
   </w:style>
 </w:styles>

</xml_diff>